<commit_message>
refreshed 9th practise and added 10th practise
</commit_message>
<xml_diff>
--- a/Практическая_8_Немчинова.docx
+++ b/Практическая_8_Немчинова.docx
@@ -1542,10 +1542,10 @@
           <w:szCs w:val="28"/>
         </w:rPr>
         <w:drawing xmlns:mc="http://schemas.openxmlformats.org/markup-compatibility/2006">
-          <wp:inline>
+          <wp:inline distT="0" distB="0" distL="0" distR="0">
             <wp:extent cx="2985770" cy="4138295"/>
             <wp:effectExtent l="0" t="0" r="0" b="0"/>
-            <wp:docPr id="1" name="Picture 1"/>
+            <wp:docPr id="15" name="Picture 1"/>
             <wp:cNvGraphicFramePr>
               <a:graphicFrameLocks xmlns:a="http://schemas.openxmlformats.org/drawingml/2006/main" noChangeAspect="1"/>
             </wp:cNvGraphicFramePr>
@@ -1553,13 +1553,13 @@
               <a:graphicData uri="http://schemas.openxmlformats.org/drawingml/2006/picture">
                 <pic:pic xmlns:pic="http://schemas.openxmlformats.org/drawingml/2006/picture">
                   <pic:nvPicPr>
-                    <pic:cNvPr id="2" name=""/>
+                    <pic:cNvPr id="1" name="Picture 1"/>
                     <pic:cNvPicPr>
                       <a:picLocks noGrp="0" noSelect="0" noChangeAspect="1" noMove="0"/>
                     </pic:cNvPicPr>
                   </pic:nvPicPr>
                   <pic:blipFill>
-                    <a:blip r:embed="rId5"/>
+                    <a:blip r:embed="rId17"/>
                     <a:srcRect/>
                     <a:stretch>
                       <a:fillRect/>
@@ -1796,10 +1796,10 @@
           <w:lang w:val="en-US"/>
         </w:rPr>
         <w:drawing xmlns:mc="http://schemas.openxmlformats.org/markup-compatibility/2006">
-          <wp:inline>
+          <wp:inline distT="0" distB="0" distL="0" distR="0">
             <wp:extent cx="4272280" cy="4596130"/>
             <wp:effectExtent l="0" t="0" r="0" b="0"/>
-            <wp:docPr id="2" name="Picture 2"/>
+            <wp:docPr id="16" name="Picture 2"/>
             <wp:cNvGraphicFramePr>
               <a:graphicFrameLocks xmlns:a="http://schemas.openxmlformats.org/drawingml/2006/main" noChangeAspect="1"/>
             </wp:cNvGraphicFramePr>
@@ -1807,13 +1807,13 @@
               <a:graphicData uri="http://schemas.openxmlformats.org/drawingml/2006/picture">
                 <pic:pic xmlns:pic="http://schemas.openxmlformats.org/drawingml/2006/picture">
                   <pic:nvPicPr>
-                    <pic:cNvPr id="3" name=""/>
+                    <pic:cNvPr id="2" name="Picture 2"/>
                     <pic:cNvPicPr>
                       <a:picLocks noGrp="0" noSelect="0" noChangeAspect="1" noMove="0"/>
                     </pic:cNvPicPr>
                   </pic:nvPicPr>
                   <pic:blipFill>
-                    <a:blip r:embed="rId6"/>
+                    <a:blip r:embed="rId18"/>
                     <a:srcRect/>
                     <a:stretch>
                       <a:fillRect/>
@@ -5720,10 +5720,10 @@
           <w:lang w:val="ru-RU"/>
         </w:rPr>
         <w:drawing xmlns:mc="http://schemas.openxmlformats.org/markup-compatibility/2006">
-          <wp:inline>
+          <wp:inline distT="0" distB="0" distL="0" distR="0">
             <wp:extent cx="3664585" cy="264795"/>
             <wp:effectExtent l="0" t="0" r="0" b="0"/>
-            <wp:docPr id="3" name="Picture 3"/>
+            <wp:docPr id="17" name="Picture 3"/>
             <wp:cNvGraphicFramePr>
               <a:graphicFrameLocks xmlns:a="http://schemas.openxmlformats.org/drawingml/2006/main" noChangeAspect="1"/>
             </wp:cNvGraphicFramePr>
@@ -5731,13 +5731,13 @@
               <a:graphicData uri="http://schemas.openxmlformats.org/drawingml/2006/picture">
                 <pic:pic xmlns:pic="http://schemas.openxmlformats.org/drawingml/2006/picture">
                   <pic:nvPicPr>
-                    <pic:cNvPr id="4" name=""/>
+                    <pic:cNvPr id="3" name="Picture 3"/>
                     <pic:cNvPicPr>
                       <a:picLocks noGrp="0" noSelect="0" noChangeAspect="1" noMove="0"/>
                     </pic:cNvPicPr>
                   </pic:nvPicPr>
                   <pic:blipFill>
-                    <a:blip r:embed="rId7"/>
+                    <a:blip r:embed="rId19"/>
                     <a:srcRect/>
                     <a:stretch>
                       <a:fillRect/>
@@ -5875,10 +5875,10 @@
           <w:szCs w:val="28"/>
         </w:rPr>
         <w:drawing xmlns:mc="http://schemas.openxmlformats.org/markup-compatibility/2006">
-          <wp:inline>
+          <wp:inline distT="0" distB="0" distL="0" distR="0">
             <wp:extent cx="4084320" cy="831215"/>
             <wp:effectExtent l="0" t="0" r="0" b="0"/>
-            <wp:docPr id="4" name="Picture 4"/>
+            <wp:docPr id="18" name="Picture 4"/>
             <wp:cNvGraphicFramePr>
               <a:graphicFrameLocks xmlns:a="http://schemas.openxmlformats.org/drawingml/2006/main" noChangeAspect="1"/>
             </wp:cNvGraphicFramePr>
@@ -5886,13 +5886,13 @@
               <a:graphicData uri="http://schemas.openxmlformats.org/drawingml/2006/picture">
                 <pic:pic xmlns:pic="http://schemas.openxmlformats.org/drawingml/2006/picture">
                   <pic:nvPicPr>
-                    <pic:cNvPr id="5" name=""/>
+                    <pic:cNvPr id="4" name="Picture 4"/>
                     <pic:cNvPicPr>
                       <a:picLocks noGrp="0" noSelect="0" noChangeAspect="1" noMove="0"/>
                     </pic:cNvPicPr>
                   </pic:nvPicPr>
                   <pic:blipFill>
-                    <a:blip r:embed="rId8"/>
+                    <a:blip r:embed="rId20"/>
                     <a:srcRect/>
                     <a:stretch>
                       <a:fillRect/>
@@ -6023,10 +6023,10 @@
           <w:lang w:val="ru-RU"/>
         </w:rPr>
         <w:drawing xmlns:mc="http://schemas.openxmlformats.org/markup-compatibility/2006">
-          <wp:inline>
+          <wp:inline distT="0" distB="0" distL="0" distR="0">
             <wp:extent cx="4283710" cy="4418330"/>
             <wp:effectExtent l="0" t="0" r="0" b="0"/>
-            <wp:docPr id="5" name="Picture 5"/>
+            <wp:docPr id="19" name="Picture 5"/>
             <wp:cNvGraphicFramePr>
               <a:graphicFrameLocks xmlns:a="http://schemas.openxmlformats.org/drawingml/2006/main" noChangeAspect="1"/>
             </wp:cNvGraphicFramePr>
@@ -6034,13 +6034,13 @@
               <a:graphicData uri="http://schemas.openxmlformats.org/drawingml/2006/picture">
                 <pic:pic xmlns:pic="http://schemas.openxmlformats.org/drawingml/2006/picture">
                   <pic:nvPicPr>
-                    <pic:cNvPr id="6" name=""/>
+                    <pic:cNvPr id="5" name="Picture 5"/>
                     <pic:cNvPicPr>
                       <a:picLocks noGrp="0" noSelect="0" noChangeAspect="1" noMove="0"/>
                     </pic:cNvPicPr>
                   </pic:nvPicPr>
                   <pic:blipFill>
-                    <a:blip r:embed="rId9"/>
+                    <a:blip r:embed="rId21"/>
                     <a:srcRect/>
                     <a:stretch>
                       <a:fillRect/>
@@ -6154,10 +6154,10 @@
           <w:lang w:val="ru-RU"/>
         </w:rPr>
         <w:drawing xmlns:mc="http://schemas.openxmlformats.org/markup-compatibility/2006">
-          <wp:inline>
+          <wp:inline distT="0" distB="0" distL="0" distR="0">
             <wp:extent cx="4161790" cy="1396365"/>
             <wp:effectExtent l="0" t="0" r="0" b="0"/>
-            <wp:docPr id="6" name="Picture 6"/>
+            <wp:docPr id="20" name="Picture 6"/>
             <wp:cNvGraphicFramePr>
               <a:graphicFrameLocks xmlns:a="http://schemas.openxmlformats.org/drawingml/2006/main" noChangeAspect="1"/>
             </wp:cNvGraphicFramePr>
@@ -6165,13 +6165,13 @@
               <a:graphicData uri="http://schemas.openxmlformats.org/drawingml/2006/picture">
                 <pic:pic xmlns:pic="http://schemas.openxmlformats.org/drawingml/2006/picture">
                   <pic:nvPicPr>
-                    <pic:cNvPr id="7" name=""/>
+                    <pic:cNvPr id="6" name="Picture 6"/>
                     <pic:cNvPicPr>
                       <a:picLocks noGrp="0" noSelect="0" noChangeAspect="1" noMove="0"/>
                     </pic:cNvPicPr>
                   </pic:nvPicPr>
                   <pic:blipFill>
-                    <a:blip r:embed="rId10"/>
+                    <a:blip r:embed="rId22"/>
                     <a:srcRect/>
                     <a:stretch>
                       <a:fillRect/>
@@ -6353,10 +6353,10 @@
           <w:szCs w:val="28"/>
         </w:rPr>
         <w:drawing xmlns:mc="http://schemas.openxmlformats.org/markup-compatibility/2006">
-          <wp:inline>
+          <wp:inline distT="0" distB="0" distL="0" distR="0">
             <wp:extent cx="2902585" cy="2176780"/>
             <wp:effectExtent l="0" t="0" r="0" b="0"/>
-            <wp:docPr id="7" name="Picture 7"/>
+            <wp:docPr id="21" name="Picture 7"/>
             <wp:cNvGraphicFramePr>
               <a:graphicFrameLocks xmlns:a="http://schemas.openxmlformats.org/drawingml/2006/main" noChangeAspect="1"/>
             </wp:cNvGraphicFramePr>
@@ -6364,13 +6364,13 @@
               <a:graphicData uri="http://schemas.openxmlformats.org/drawingml/2006/picture">
                 <pic:pic xmlns:pic="http://schemas.openxmlformats.org/drawingml/2006/picture">
                   <pic:nvPicPr>
-                    <pic:cNvPr id="8" name=""/>
+                    <pic:cNvPr id="7" name="Picture 7"/>
                     <pic:cNvPicPr>
                       <a:picLocks noGrp="0" noSelect="0" noChangeAspect="1" noMove="0"/>
                     </pic:cNvPicPr>
                   </pic:nvPicPr>
                   <pic:blipFill>
-                    <a:blip r:embed="rId11"/>
+                    <a:blip r:embed="rId23"/>
                     <a:srcRect/>
                     <a:stretch>
                       <a:fillRect/>
@@ -7817,11 +7817,10 @@
       </w:pPr>
     </w:p>
     <w:sectPr>
-      <w:headerReference w:type="default" r:id="rId12"/>
-      <w:headerReference w:type="first" r:id="rId13"/>
-      <w:footerReference w:type="default" r:id="rId14"/>
-      <w:footerReference w:type="first" r:id="rId15"/>
-      <w:footnotePr/>
+      <w:headerReference w:type="default" r:id="rId24"/>
+      <w:headerReference w:type="first" r:id="rId25"/>
+      <w:footerReference w:type="default" r:id="rId26"/>
+      <w:footerReference w:type="first" r:id="rId27"/>
       <w:footnotePr/>
       <w:type w:val="nextPage"/>
       <w:pgSz w:w="11906" w:h="16838" w:orient="portrait"/>

</xml_diff>